<commit_message>
Add validation sample and evidence for issue #69139
</commit_message>
<xml_diff>
--- a/Evidence/TempDataAndSession_KeyLifetimeValidationReport.docx
+++ b/Evidence/TempDataAndSession_KeyLifetimeValidationReport.docx
@@ -365,15 +365,18 @@
                 <w:bCs/>
               </w:rPr>
             </w:pPr>
-            <w:proofErr w:type="spellStart"/>
-            <w:r>
-              <w:rPr>
-                <w:b/>
-                <w:bCs/>
-              </w:rPr>
-              <w:t>DefaultKeySharing</w:t>
-            </w:r>
-            <w:proofErr w:type="spellEnd"/>
+            <w:hyperlink r:id="rId7" w:history="1">
+              <w:proofErr w:type="spellStart"/>
+              <w:r>
+                <w:rPr>
+                  <w:rStyle w:val="Hyperlink"/>
+                  <w:b/>
+                  <w:bCs/>
+                </w:rPr>
+                <w:t>DefaultKeySharing</w:t>
+              </w:r>
+              <w:proofErr w:type="spellEnd"/>
+            </w:hyperlink>
           </w:p>
         </w:tc>
       </w:tr>
@@ -460,15 +463,18 @@
                 <w:bCs/>
               </w:rPr>
             </w:pPr>
-            <w:proofErr w:type="spellStart"/>
-            <w:r>
-              <w:rPr>
-                <w:b/>
-                <w:bCs/>
-              </w:rPr>
-              <w:t>DuplicateKeyConflict</w:t>
-            </w:r>
-            <w:proofErr w:type="spellEnd"/>
+            <w:hyperlink r:id="rId8" w:history="1">
+              <w:proofErr w:type="spellStart"/>
+              <w:r>
+                <w:rPr>
+                  <w:rStyle w:val="Hyperlink"/>
+                  <w:b/>
+                  <w:bCs/>
+                </w:rPr>
+                <w:t>DuplicateKeyConflict</w:t>
+              </w:r>
+              <w:proofErr w:type="spellEnd"/>
+            </w:hyperlink>
           </w:p>
         </w:tc>
       </w:tr>
@@ -552,15 +558,18 @@
                 <w:bCs/>
               </w:rPr>
             </w:pPr>
-            <w:proofErr w:type="spellStart"/>
-            <w:r>
-              <w:rPr>
-                <w:b/>
-                <w:bCs/>
-              </w:rPr>
-              <w:t>NullValuePersistence</w:t>
-            </w:r>
-            <w:proofErr w:type="spellEnd"/>
+            <w:hyperlink r:id="rId9" w:history="1">
+              <w:proofErr w:type="spellStart"/>
+              <w:r>
+                <w:rPr>
+                  <w:rStyle w:val="Hyperlink"/>
+                  <w:b/>
+                  <w:bCs/>
+                </w:rPr>
+                <w:t>NullValuePersistence</w:t>
+              </w:r>
+              <w:proofErr w:type="spellEnd"/>
+            </w:hyperlink>
           </w:p>
         </w:tc>
       </w:tr>
@@ -639,15 +648,18 @@
                 <w:bCs/>
               </w:rPr>
             </w:pPr>
-            <w:proofErr w:type="spellStart"/>
-            <w:r>
-              <w:rPr>
-                <w:b/>
-                <w:bCs/>
-              </w:rPr>
-              <w:t>DistinctKeyIsolation</w:t>
-            </w:r>
-            <w:proofErr w:type="spellEnd"/>
+            <w:hyperlink r:id="rId10" w:history="1">
+              <w:proofErr w:type="spellStart"/>
+              <w:r>
+                <w:rPr>
+                  <w:rStyle w:val="Hyperlink"/>
+                  <w:b/>
+                  <w:bCs/>
+                </w:rPr>
+                <w:t>DistinctKeyIsolation</w:t>
+              </w:r>
+              <w:proofErr w:type="spellEnd"/>
+            </w:hyperlink>
           </w:p>
         </w:tc>
       </w:tr>
@@ -742,15 +754,18 @@
                 <w:bCs/>
               </w:rPr>
             </w:pPr>
-            <w:proofErr w:type="spellStart"/>
-            <w:r>
-              <w:rPr>
-                <w:b/>
-                <w:bCs/>
-              </w:rPr>
-              <w:t>UnusedPageValueRetention</w:t>
-            </w:r>
-            <w:proofErr w:type="spellEnd"/>
+            <w:hyperlink r:id="rId11" w:history="1">
+              <w:proofErr w:type="spellStart"/>
+              <w:r>
+                <w:rPr>
+                  <w:rStyle w:val="Hyperlink"/>
+                  <w:b/>
+                  <w:bCs/>
+                </w:rPr>
+                <w:t>UnusedPageValueRetention</w:t>
+              </w:r>
+              <w:proofErr w:type="spellEnd"/>
+            </w:hyperlink>
           </w:p>
         </w:tc>
       </w:tr>
@@ -837,13 +852,16 @@
                 <w:bCs/>
               </w:rPr>
             </w:pPr>
-            <w:r>
-              <w:rPr>
-                <w:b/>
-                <w:bCs/>
-              </w:rPr>
-              <w:t>SequentialReloadRetention</w:t>
-            </w:r>
+            <w:hyperlink r:id="rId12" w:history="1">
+              <w:r>
+                <w:rPr>
+                  <w:rStyle w:val="Hyperlink"/>
+                  <w:b/>
+                  <w:bCs/>
+                </w:rPr>
+                <w:t>SequentialReloadRetention</w:t>
+              </w:r>
+            </w:hyperlink>
           </w:p>
         </w:tc>
       </w:tr>
@@ -855,7 +873,11 @@
           <w:tcPr>
             <w:tcW w:w="785" w:type="dxa"/>
           </w:tcPr>
-          <w:p/>
+          <w:p>
+            <w:r>
+              <w:t>7</w:t>
+            </w:r>
+          </w:p>
         </w:tc>
         <w:tc>
           <w:tcPr>
@@ -918,15 +940,18 @@
                 <w:bCs/>
               </w:rPr>
             </w:pPr>
-            <w:proofErr w:type="spellStart"/>
-            <w:r>
-              <w:rPr>
-                <w:b/>
-                <w:bCs/>
-              </w:rPr>
-              <w:t>NavigationRoundTripPersistence</w:t>
-            </w:r>
-            <w:proofErr w:type="spellEnd"/>
+            <w:hyperlink r:id="rId13" w:history="1">
+              <w:proofErr w:type="spellStart"/>
+              <w:r>
+                <w:rPr>
+                  <w:rStyle w:val="Hyperlink"/>
+                  <w:b/>
+                  <w:bCs/>
+                </w:rPr>
+                <w:t>NavigationRoundTripPersistence</w:t>
+              </w:r>
+              <w:proofErr w:type="spellEnd"/>
+            </w:hyperlink>
           </w:p>
         </w:tc>
       </w:tr>
@@ -938,7 +963,11 @@
           <w:tcPr>
             <w:tcW w:w="785" w:type="dxa"/>
           </w:tcPr>
-          <w:p/>
+          <w:p>
+            <w:r>
+              <w:t>8</w:t>
+            </w:r>
+          </w:p>
         </w:tc>
         <w:tc>
           <w:tcPr>
@@ -1001,15 +1030,18 @@
                 <w:bCs/>
               </w:rPr>
             </w:pPr>
-            <w:proofErr w:type="spellStart"/>
-            <w:r>
-              <w:rPr>
-                <w:b/>
-                <w:bCs/>
-              </w:rPr>
-              <w:t>SharedKeyPropertyMapping</w:t>
-            </w:r>
-            <w:proofErr w:type="spellEnd"/>
+            <w:hyperlink r:id="rId14" w:history="1">
+              <w:proofErr w:type="spellStart"/>
+              <w:r>
+                <w:rPr>
+                  <w:rStyle w:val="Hyperlink"/>
+                  <w:b/>
+                  <w:bCs/>
+                </w:rPr>
+                <w:t>SharedKeyPropertyMapping</w:t>
+              </w:r>
+              <w:proofErr w:type="spellEnd"/>
+            </w:hyperlink>
           </w:p>
         </w:tc>
       </w:tr>
@@ -1021,7 +1053,11 @@
           <w:tcPr>
             <w:tcW w:w="785" w:type="dxa"/>
           </w:tcPr>
-          <w:p/>
+          <w:p>
+            <w:r>
+              <w:t>9</w:t>
+            </w:r>
+          </w:p>
         </w:tc>
         <w:tc>
           <w:tcPr>
@@ -1094,15 +1130,18 @@
                 <w:bCs/>
               </w:rPr>
             </w:pPr>
-            <w:proofErr w:type="spellStart"/>
-            <w:r>
-              <w:rPr>
-                <w:b/>
-                <w:bCs/>
-              </w:rPr>
-              <w:t>ExplicitDefaultKeyComparison</w:t>
-            </w:r>
-            <w:proofErr w:type="spellEnd"/>
+            <w:hyperlink r:id="rId15" w:history="1">
+              <w:proofErr w:type="spellStart"/>
+              <w:r>
+                <w:rPr>
+                  <w:rStyle w:val="Hyperlink"/>
+                  <w:b/>
+                  <w:bCs/>
+                </w:rPr>
+                <w:t>ExplicitDefaultKeyComparison</w:t>
+              </w:r>
+              <w:proofErr w:type="spellEnd"/>
+            </w:hyperlink>
           </w:p>
         </w:tc>
       </w:tr>
@@ -1114,7 +1153,11 @@
           <w:tcPr>
             <w:tcW w:w="785" w:type="dxa"/>
           </w:tcPr>
-          <w:p/>
+          <w:p>
+            <w:r>
+              <w:t>10</w:t>
+            </w:r>
+          </w:p>
         </w:tc>
         <w:tc>
           <w:tcPr>
@@ -1177,15 +1220,18 @@
                 <w:bCs/>
               </w:rPr>
             </w:pPr>
-            <w:proofErr w:type="spellStart"/>
-            <w:r>
-              <w:rPr>
-                <w:b/>
-                <w:bCs/>
-              </w:rPr>
-              <w:t>UniqueKeyValueIsolation</w:t>
-            </w:r>
-            <w:proofErr w:type="spellEnd"/>
+            <w:hyperlink r:id="rId16" w:history="1">
+              <w:proofErr w:type="spellStart"/>
+              <w:r>
+                <w:rPr>
+                  <w:rStyle w:val="Hyperlink"/>
+                  <w:b/>
+                  <w:bCs/>
+                </w:rPr>
+                <w:t>UniqueKeyValueIsolation</w:t>
+              </w:r>
+              <w:proofErr w:type="spellEnd"/>
+            </w:hyperlink>
           </w:p>
           <w:p>
             <w:pPr>
@@ -1205,7 +1251,11 @@
           <w:tcPr>
             <w:tcW w:w="785" w:type="dxa"/>
           </w:tcPr>
-          <w:p/>
+          <w:p>
+            <w:r>
+              <w:t>11</w:t>
+            </w:r>
+          </w:p>
         </w:tc>
         <w:tc>
           <w:tcPr>
@@ -1268,21 +1318,32 @@
                 <w:bCs/>
               </w:rPr>
             </w:pPr>
-            <w:proofErr w:type="spellStart"/>
-            <w:r>
-              <w:rPr>
-                <w:b/>
-                <w:bCs/>
-              </w:rPr>
-              <w:t>NullAssignmentRetention</w:t>
-            </w:r>
-            <w:proofErr w:type="spellEnd"/>
-            <w:r>
-              <w:rPr>
-                <w:b/>
-                <w:bCs/>
-              </w:rPr>
-              <w:t xml:space="preserve">   </w:t>
+            <w:hyperlink r:id="rId17" w:history="1">
+              <w:proofErr w:type="spellStart"/>
+              <w:r>
+                <w:rPr>
+                  <w:rStyle w:val="Hyperlink"/>
+                  <w:b/>
+                  <w:bCs/>
+                </w:rPr>
+                <w:t>NullAssignmentRetention</w:t>
+              </w:r>
+              <w:proofErr w:type="spellEnd"/>
+              <w:r>
+                <w:rPr>
+                  <w:rStyle w:val="Hyperlink"/>
+                  <w:b/>
+                  <w:bCs/>
+                </w:rPr>
+                <w:t xml:space="preserve">  </w:t>
+              </w:r>
+            </w:hyperlink>
+            <w:r>
+              <w:rPr>
+                <w:b/>
+                <w:bCs/>
+              </w:rPr>
+              <w:t xml:space="preserve"> </w:t>
             </w:r>
           </w:p>
         </w:tc>
@@ -1295,7 +1356,11 @@
           <w:tcPr>
             <w:tcW w:w="785" w:type="dxa"/>
           </w:tcPr>
-          <w:p/>
+          <w:p>
+            <w:r>
+              <w:t>12</w:t>
+            </w:r>
+          </w:p>
         </w:tc>
         <w:tc>
           <w:tcPr>
@@ -1358,15 +1423,18 @@
                 <w:bCs/>
               </w:rPr>
             </w:pPr>
-            <w:proofErr w:type="spellStart"/>
-            <w:r>
-              <w:rPr>
-                <w:b/>
-                <w:bCs/>
-              </w:rPr>
-              <w:t>IdleRequestPersistence</w:t>
-            </w:r>
-            <w:proofErr w:type="spellEnd"/>
+            <w:hyperlink r:id="rId18" w:history="1">
+              <w:proofErr w:type="spellStart"/>
+              <w:r>
+                <w:rPr>
+                  <w:rStyle w:val="Hyperlink"/>
+                  <w:b/>
+                  <w:bCs/>
+                </w:rPr>
+                <w:t>IdleRequestPersistence</w:t>
+              </w:r>
+              <w:proofErr w:type="spellEnd"/>
+            </w:hyperlink>
           </w:p>
           <w:p>
             <w:pPr>
@@ -2156,6 +2224,7 @@
   <w:style w:type="character" w:default="1" w:styleId="DefaultParagraphFont">
     <w:name w:val="Default Paragraph Font"/>
     <w:uiPriority w:val="1"/>
+    <w:semiHidden/>
     <w:unhideWhenUsed/>
   </w:style>
   <w:style w:type="table" w:default="1" w:styleId="TableNormal">

</xml_diff>